<commit_message>
Expand INJOIT bibliography to 25 sources and verify numerical preservation
</commit_message>
<xml_diff>
--- a/articles/Статья_INJOIT_Численный_метод_выбора_действий_редакция_2026-10-23.docx
+++ b/articles/Статья_INJOIT_Численный_метод_выбора_действий_редакция_2026-10-23.docx
@@ -170,7 +170,35 @@
           <w:color w:val="000000"/>
           <w:lang w:val="ru-RU"/>
         </w:rPr>
-        <w:t xml:space="preserve">Адаптивный выбор учебных действий с учётом времени и экспертных ограничений уже исследуется, в частности с помощью многоруких бандитов [4]. При фиксированном наборе альтернатив общая ёмкость ресурсов приводит к вариантам задачи о рюкзаке с множественным выбором [5]–[7]. Динамическое программирование и отношения доминирования относятся к известным средствам её решения. Планирование диагностики опирается на теоретико-решенческое понимание ценности информации [8].</w:t>
+        <w:t xml:space="preserve">Обзоры моделей обучающегося [4], объяснимого отслеживания знаний [5] и гибридных подходов [6] показывают разнообразие способов описания состояния. В рассматриваемой короткой диагностике используется статическая сопряжённая модель, пригодность которой определяется сопоставимостью заданий и условиями самостоятельности. Графовое планирование [7] задаёт содержательные связи; согласование проверок по общим ресурсам составляет отдельную вычислительную задачу.</w:t>
+      </w:r>
+    </w:p>
+    <w:p>
+      <w:pPr>
+        <w:pStyle w:val="Text"/>
+        <w:widowControl w:val="1"/>
+      </w:pPr>
+      <w:r>
+        <w:rPr>
+          <w:rFonts w:ascii="Times New Roman" w:hAnsi="Times New Roman" w:cs="Times New Roman"/>
+          <w:color w:val="000000"/>
+          <w:lang w:val="ru-RU"/>
+        </w:rPr>
+        <w:t xml:space="preserve">Разделение функций человека и ИИ рассматривается в [8]. Исследования обучения с генеративной помощью показывают зависимость результата от организации поддержки и последующего самостоятельного контроля [9], [10]. Работа о GigaCode [11] характеризует возможности кодового ассистента; её выводы не используются как подтверждение эффективности предлагаемого правила допуска.</w:t>
+      </w:r>
+    </w:p>
+    <w:p>
+      <w:pPr>
+        <w:pStyle w:val="Text"/>
+        <w:widowControl w:val="1"/>
+      </w:pPr>
+      <w:r>
+        <w:rPr>
+          <w:rFonts w:ascii="Times New Roman" w:hAnsi="Times New Roman" w:cs="Times New Roman"/>
+          <w:color w:val="000000"/>
+          <w:lang w:val="ru-RU"/>
+        </w:rPr>
+        <w:t xml:space="preserve">Адаптивный выбор учебных действий с учётом времени и экспертных ограничений уже исследуется, в частности с помощью многоруких бандитов [12]. При фиксированном наборе альтернатив общая ёмкость ресурсов приводит к вариантам задачи о рюкзаке с множественным выбором [13]–[15]; обзор задач с одним рюкзаком дополняет эту классификацию [16]. Динамическое программирование и отношения доминирования относятся к известным средствам её решения. Планирование диагностики опирается на теоретико-решенческое понимание ценности информации [17]. Современные обзоры [18], [19] связывают выбор дизайна с целью получения данных. Здесь диагностическая ценность определяется ожидаемой терминальной потерей, а не только информационным выигрышем.</w:t>
       </w:r>
     </w:p>
     <w:p>
@@ -621,7 +649,7 @@
           <w:color w:val="000000"/>
           <w:lang w:val="ru-RU"/>
         </w:rPr>
-        <w:t xml:space="preserve">Повторы одного шаблона, работы с внешней помощью и неподтверждённые оценки не образуют дополнительные независимые испытания. Различие версий и происхождения свидетельств задаётся до применения (1). Параметры разных предпосылок апостериорно независимы – это допущение расчёта ожидаемых потерь, которое подлежит проверке при использовании реальных данных.</w:t>
+        <w:t xml:space="preserve">Повторы одного шаблона, работы с внешней помощью и неподтверждённые оценки не образуют дополнительные независимые испытания. Различие версий и происхождения свидетельств задаётся до применения (1). Содержательная связь задания с утверждением об обучающемся соответствует логике проектирования оценивания на основе свидетельств [20]. Параметры разных предпосылок апостериорно независимы – это допущение расчёта ожидаемых потерь, которое подлежит проверке при использовании реальных данных.</w:t>
       </w:r>
     </w:p>
     <w:p>
@@ -2416,7 +2444,7 @@
           <w:color w:val="000000"/>
           <w:lang w:val="ru-RU"/>
         </w:rPr>
-        <w:t xml:space="preserve">Для положительных целых a,b неполная бета-функция выражается конечной биномиальной суммой [9]. При τ=4/5 она вычисляется в рациональной арифметике:</w:t>
+        <w:t xml:space="preserve">Для положительных целых a,b неполная бета-функция выражается конечной биномиальной суммой [21]. При τ=4/5 она вычисляется в рациональной арифметике:</w:t>
       </w:r>
     </w:p>
     <w:p>
@@ -2673,7 +2701,7 @@
           <w:color w:val="000000"/>
           <w:lang w:val="ru-RU"/>
         </w:rPr>
-        <w:t xml:space="preserve">Это известное тождество, используемое как вычислительный компонент. Для рациональных стоимостей и целого ν распределение (3), значения (4) и тест ρ≤δ также рациональны. Сравнение риска с порогом выполняется без округления в двоичный float. Важность разделения арифметической погрешности и смысла исходных данных следует из общих свойств вычислений с плавающей точкой [10]. Точность арифметики не исправляет неверно заданный статистический закон.</w:t>
+        <w:t xml:space="preserve">Это известное тождество, используемое как вычислительный компонент. Для рациональных стоимостей и целого ν распределение (3), значения (4) и тест ρ≤δ также рациональны. Сравнение риска с порогом выполняется без округления в двоичный float. Важность разделения арифметической погрешности и смысла исходных данных следует из общих свойств вычислений с плавающей точкой [22]. Точность арифметики не исправляет неверно заданный статистический закон.</w:t>
       </w:r>
     </w:p>
     <w:p>
@@ -2687,7 +2715,7 @@
           <w:color w:val="000000"/>
           <w:lang w:val="ru-RU"/>
         </w:rPr>
-        <w:t xml:space="preserve">Суммы кэшируются по парам (a,b); предиктивные пакеты – по состоянию, j и ν. Для больших историй растёт длина целых чисел, поэтому рациональный вариант не объявляется универсально быстрым. Его область – умеренные объёмы независимых свидетельств и конечный набор диагностик. При нецелых параметрах или вещественных весах потребуются другой численный оценщик риска и отдельный контроль его погрешности.</w:t>
+        <w:t xml:space="preserve">Суммы кэшируются по парам (a,b); предиктивные пакеты – по состоянию, j и ν. Для больших историй растёт длина целых чисел, поэтому рациональный вариант не объявляется универсально быстрым. Его область – умеренные объёмы независимых свидетельств и конечный набор диагностик. При нецелых параметрах или вещественных весах потребуются другой численный оценщик риска и отдельный контроль его погрешности. Классические устойчивые процедуры неполной бета-функции представлены в [23]; используемая здесь конечная рациональная сумма (6) является другим вычислительным вариантом.</w:t>
       </w:r>
     </w:p>
     <w:p>
@@ -3512,7 +3540,7 @@
           <w:color w:val="000000"/>
           <w:lang w:val="ru-RU"/>
         </w:rPr>
-        <w:t xml:space="preserve">Реализация использует Python 3.12.14, стандартный модуль fractions [11] и однопоточный расчёт на AMD Ryzen 5 5500U под Windows 11. Время согласования измерено после подготовки альтернатив; для округлённого метода взята медиана трёх запусков, для каждой размерности затем медиана пяти наборов. Подготовка вероятностных значений и генерация входов в эти интервалы не входят. Эталон выполнен по одному запуску на набор; его время приводится как ориентир, без вывода о стабильном коэффициенте ускорения.</w:t>
+        <w:t xml:space="preserve">Реализация использует Python 3.12.14, стандартный модуль fractions [24] и однопоточный расчёт на AMD Ryzen 5 5500U под Windows 11. Время согласования измерено после подготовки альтернатив; для округлённого метода взята медиана трёх запусков, для каждой размерности затем медиана пяти наборов. Подготовка вероятностных значений и генерация входов в эти интервалы не входят. Эталон выполнен по одному запуску на набор; его время приводится как ориентир, без вывода о стабильном коэффициенте ускорения.</w:t>
       </w:r>
     </w:p>
     <w:p>
@@ -5318,6 +5346,20 @@
           <w:color w:val="000000"/>
           <w:lang w:val="ru-RU"/>
         </w:rPr>
+        <w:t xml:space="preserve">Анализ цифровизации образовательных услуг на региональных данных [25] относится к другому уровню наблюдения. Такие агрегаты полезны для контекста развития системы, однако не определяют индивидуальные вероятности успеха и стоимости ошибок в данном вычислительном опыте.</w:t>
+      </w:r>
+    </w:p>
+    <w:p>
+      <w:pPr>
+        <w:pStyle w:val="Text"/>
+        <w:widowControl w:val="1"/>
+      </w:pPr>
+      <w:r>
+        <w:rPr>
+          <w:rFonts w:ascii="Times New Roman" w:hAnsi="Times New Roman" w:cs="Times New Roman"/>
+          <w:color w:val="000000"/>
+          <w:lang w:val="ru-RU"/>
+        </w:rPr>
         <w:t xml:space="preserve">В программном комплексе входом метода служат снимок состояния и версии правил, выходом – выбранные действия, потребление обоих ресурсов, исходный и округлённый выигрыши и цепочка предшественников. По этим данным можно повторить расчёт и объяснить, почему заявка получила диагностику либо отсрочку. Разработанный численный эксперимент выполнен отдельным модулем; функционирование этого оптимизатора на реальных учебных группах не заявляется.</w:t>
       </w:r>
     </w:p>
@@ -5520,7 +5562,7 @@
           <w:color w:val="000000"/>
           <w:lang w:val="ru-RU"/>
         </w:rPr>
-        <w:t xml:space="preserve">B. Clement, D. Roy, P.-Y. Oudeyer, and M. Lopes, “Multi-armed bandits for intelligent tutoring systems,” Journal of Educational Data Mining, vol. 7, no. 2, pp. 20–48, 2015. doi: https://doi.org/10.5281/zenodo.3554667.</w:t>
+        <w:t xml:space="preserve">R. Pelánek, “Bayesian knowledge tracing, logistic models, and beyond: An overview of learner modeling techniques,” User Modeling and User-Adapted Interaction, vol. 27, no. 3–5, pp. 313–350, 2017. doi: https://doi.org/10.1007/s11257-017-9193-2.</w:t>
       </w:r>
     </w:p>
     <w:p>
@@ -5556,7 +5598,7 @@
           <w:color w:val="000000"/>
           <w:lang w:val="ru-RU"/>
         </w:rPr>
-        <w:t xml:space="preserve">H. Kellerer, U. Pferschy, and D. Pisinger, Knapsack Problems. Berlin: Springer, 2004, ch. 9, 11, pp. 235–283, 317–347. doi: https://doi.org/10.1007/978-3-540-24777-7.</w:t>
+        <w:t xml:space="preserve">Y. Bai, J. Zhao, T. Wei, Q. Cai, and L. He, “A survey of explainable knowledge tracing,” Applied Intelligence, vol. 54, no. 8, pp. 6483–6514, 2024. doi: https://doi.org/10.1007/s10489-024-05509-8.</w:t>
       </w:r>
     </w:p>
     <w:p>
@@ -5592,7 +5634,7 @@
           <w:color w:val="000000"/>
           <w:lang w:val="ru-RU"/>
         </w:rPr>
-        <w:t xml:space="preserve">V. Cacchiani, M. Iori, A. Locatelli, and S. Martello, “Knapsack problems – An overview of recent advances. Part II: Multiple, multidimensional, and quadratic knapsack problems,” Computers &amp; Operations Research, vol. 143, art. 105693, 2022. doi: https://doi.org/10.1016/j.cor.2021.105693.</w:t>
+        <w:t xml:space="preserve">A. Zanellati, D. Di Mitri, M. Gabbrielli, and O. Levrini, “Hybrid models for knowledge tracing: A systematic literature review,” IEEE Transactions on Learning Technologies, vol. 17, pp. 1021–1036, 2024. doi: https://doi.org/10.1109/TLT.2023.3348690.</w:t>
       </w:r>
     </w:p>
     <w:p>
@@ -5628,7 +5670,7 @@
           <w:color w:val="000000"/>
           <w:lang w:val="ru-RU"/>
         </w:rPr>
-        <w:t xml:space="preserve">T. Szkaliczki, “Solution methods for the multiple-choice knapsack problem and their applications,” Mathematics, vol. 13, no. 7, art. 1097, 2025. doi: https://doi.org/10.3390/math13071097.</w:t>
+        <w:t xml:space="preserve">B. Hou, Y. Lin, Y. Li, C. Fang, C. Li, and X. Wang, “KG-PLPPM: A knowledge graph-based personal learning path planning method used in online learning,” Electronics, vol. 14, no. 2, art. 255, 2025. doi: https://doi.org/10.3390/electronics14020255.</w:t>
       </w:r>
     </w:p>
     <w:p>
@@ -5664,7 +5706,7 @@
           <w:color w:val="000000"/>
           <w:lang w:val="ru-RU"/>
         </w:rPr>
-        <w:t xml:space="preserve">K. Chaloner and I. Verdinelli, “Bayesian experimental design: A review,” Statistical Science, vol. 10, no. 3, pp. 273–304, 1995. doi: https://doi.org/10.1214/ss/1177009939.</w:t>
+        <w:t xml:space="preserve">I. Molenaar, “Towards hybrid human-AI learning technologies,” European Journal of Education, vol. 57, no. 4, pp. 632–645, 2022. doi: https://doi.org/10.1111/ejed.12527.</w:t>
       </w:r>
     </w:p>
     <w:p>
@@ -5700,7 +5742,7 @@
           <w:color w:val="000000"/>
           <w:lang w:val="ru-RU"/>
         </w:rPr>
-        <w:t xml:space="preserve">NIST Digital Library of Mathematical Functions, “Incomplete beta functions,” §8.17, formula 8.17.5. [Online]. Available: https://dlmf.nist.gov/8.17.E5 (дата обращения: 22.10.2026).</w:t>
+        <w:t xml:space="preserve">H. Bastani, O. Bastani, A. Sungu, H. Ge, Ö. Kabakcı, and R. Mariman, “Generative AI without guardrails can harm learning: Evidence from high school mathematics,” Proceedings of the National Academy of Sciences, vol. 122, no. 26, art. e2422633122, 2025. doi: https://doi.org/10.1073/pnas.2422633122.</w:t>
       </w:r>
     </w:p>
     <w:p>
@@ -5736,7 +5778,7 @@
           <w:color w:val="000000"/>
           <w:lang w:val="ru-RU"/>
         </w:rPr>
-        <w:t xml:space="preserve">D. Goldberg, “What every computer scientist should know about floating-point arithmetic,” ACM Computing Surveys, vol. 23, no. 1, pp. 5–48, 1991. doi: https://doi.org/10.1145/103162.103163.</w:t>
+        <w:t xml:space="preserve">G. Kestin, K. Miller, A. Klales, T. Milbourne, and G. Ponti, “AI tutoring outperforms in-class active learning: An RCT introducing a novel research-based design in an authentic educational setting,” Scientific Reports, vol. 15, art. 17458, 2025. doi: https://doi.org/10.1038/s41598-025-97652-6.</w:t>
       </w:r>
     </w:p>
     <w:p>
@@ -5772,7 +5814,511 @@
           <w:color w:val="000000"/>
           <w:lang w:val="ru-RU"/>
         </w:rPr>
+        <w:t xml:space="preserve">А. И. Гайдамака, С. Р. Муминова и А. В. Куприянов, «Использование GigaCode в деятельности IT-компаний», Цифровые решения и технологии искусственного интеллекта, т. 1, № 2, с. 18–25, 2025. [Электронный ресурс]. URL: https://www.digitarin.ru/jour/article/view/9 (дата обращения: 23.10.2026).</w:t>
+      </w:r>
+    </w:p>
+    <w:p>
+      <w:pPr>
+        <w:pStyle w:val="References"/>
+        <w:widowControl w:val="1"/>
+        <w:numPr>
+          <w:numId w:val="0"/>
+        </w:numPr>
+        <w:ind w:left="350" w:hanging="350"/>
+        <w:tabs>
+          <w:tab w:val="left" w:pos="350"/>
+        </w:tabs>
+      </w:pPr>
+      <w:r>
+        <w:rPr>
+          <w:rFonts w:ascii="Times New Roman" w:hAnsi="Times New Roman" w:cs="Times New Roman"/>
+          <w:sz w:val="16"/>
+          <w:szCs w:val="16"/>
+          <w:color w:val="000000"/>
+          <w:lang w:val="ru-RU"/>
+        </w:rPr>
+        <w:t xml:space="preserve">[12]</w:t>
+      </w:r>
+      <w:r>
+        <w:tab/>
+      </w:r>
+      <w:r>
+        <w:rPr>
+          <w:rFonts w:ascii="Times New Roman" w:hAnsi="Times New Roman" w:cs="Times New Roman"/>
+          <w:sz w:val="16"/>
+          <w:szCs w:val="16"/>
+          <w:color w:val="000000"/>
+          <w:lang w:val="ru-RU"/>
+        </w:rPr>
+        <w:t xml:space="preserve">B. Clement, D. Roy, P.-Y. Oudeyer, and M. Lopes, “Multi-armed bandits for intelligent tutoring systems,” Journal of Educational Data Mining, vol. 7, no. 2, pp. 20–48, 2015. doi: https://doi.org/10.5281/zenodo.3554667.</w:t>
+      </w:r>
+    </w:p>
+    <w:p>
+      <w:pPr>
+        <w:pStyle w:val="References"/>
+        <w:widowControl w:val="1"/>
+        <w:numPr>
+          <w:numId w:val="0"/>
+        </w:numPr>
+        <w:ind w:left="350" w:hanging="350"/>
+        <w:tabs>
+          <w:tab w:val="left" w:pos="350"/>
+        </w:tabs>
+      </w:pPr>
+      <w:r>
+        <w:rPr>
+          <w:rFonts w:ascii="Times New Roman" w:hAnsi="Times New Roman" w:cs="Times New Roman"/>
+          <w:sz w:val="16"/>
+          <w:szCs w:val="16"/>
+          <w:color w:val="000000"/>
+          <w:lang w:val="ru-RU"/>
+        </w:rPr>
+        <w:t xml:space="preserve">[13]</w:t>
+      </w:r>
+      <w:r>
+        <w:tab/>
+      </w:r>
+      <w:r>
+        <w:rPr>
+          <w:rFonts w:ascii="Times New Roman" w:hAnsi="Times New Roman" w:cs="Times New Roman"/>
+          <w:sz w:val="16"/>
+          <w:szCs w:val="16"/>
+          <w:color w:val="000000"/>
+          <w:lang w:val="ru-RU"/>
+        </w:rPr>
+        <w:t xml:space="preserve">H. Kellerer, U. Pferschy, and D. Pisinger, Knapsack Problems. Berlin: Springer, 2004, ch. 9, 11, pp. 235–283, 317–347. doi: https://doi.org/10.1007/978-3-540-24777-7.</w:t>
+      </w:r>
+    </w:p>
+    <w:p>
+      <w:pPr>
+        <w:pStyle w:val="References"/>
+        <w:widowControl w:val="1"/>
+        <w:numPr>
+          <w:numId w:val="0"/>
+        </w:numPr>
+        <w:ind w:left="350" w:hanging="350"/>
+        <w:tabs>
+          <w:tab w:val="left" w:pos="350"/>
+        </w:tabs>
+      </w:pPr>
+      <w:r>
+        <w:rPr>
+          <w:rFonts w:ascii="Times New Roman" w:hAnsi="Times New Roman" w:cs="Times New Roman"/>
+          <w:sz w:val="16"/>
+          <w:szCs w:val="16"/>
+          <w:color w:val="000000"/>
+          <w:lang w:val="ru-RU"/>
+        </w:rPr>
+        <w:t xml:space="preserve">[14]</w:t>
+      </w:r>
+      <w:r>
+        <w:tab/>
+      </w:r>
+      <w:r>
+        <w:rPr>
+          <w:rFonts w:ascii="Times New Roman" w:hAnsi="Times New Roman" w:cs="Times New Roman"/>
+          <w:sz w:val="16"/>
+          <w:szCs w:val="16"/>
+          <w:color w:val="000000"/>
+          <w:lang w:val="ru-RU"/>
+        </w:rPr>
+        <w:t xml:space="preserve">V. Cacchiani, M. Iori, A. Locatelli, and S. Martello, “Knapsack problems – An overview of recent advances. Part II: Multiple, multidimensional, and quadratic knapsack problems,” Computers &amp; Operations Research, vol. 143, art. 105693, 2022. doi: https://doi.org/10.1016/j.cor.2021.105693.</w:t>
+      </w:r>
+    </w:p>
+    <w:p>
+      <w:pPr>
+        <w:pStyle w:val="References"/>
+        <w:widowControl w:val="1"/>
+        <w:numPr>
+          <w:numId w:val="0"/>
+        </w:numPr>
+        <w:ind w:left="350" w:hanging="350"/>
+        <w:tabs>
+          <w:tab w:val="left" w:pos="350"/>
+        </w:tabs>
+      </w:pPr>
+      <w:r>
+        <w:rPr>
+          <w:rFonts w:ascii="Times New Roman" w:hAnsi="Times New Roman" w:cs="Times New Roman"/>
+          <w:sz w:val="16"/>
+          <w:szCs w:val="16"/>
+          <w:color w:val="000000"/>
+          <w:lang w:val="ru-RU"/>
+        </w:rPr>
+        <w:t xml:space="preserve">[15]</w:t>
+      </w:r>
+      <w:r>
+        <w:tab/>
+      </w:r>
+      <w:r>
+        <w:rPr>
+          <w:rFonts w:ascii="Times New Roman" w:hAnsi="Times New Roman" w:cs="Times New Roman"/>
+          <w:sz w:val="16"/>
+          <w:szCs w:val="16"/>
+          <w:color w:val="000000"/>
+          <w:lang w:val="ru-RU"/>
+        </w:rPr>
+        <w:t xml:space="preserve">T. Szkaliczki, “Solution methods for the multiple-choice knapsack problem and their applications,” Mathematics, vol. 13, no. 7, art. 1097, 2025. doi: https://doi.org/10.3390/math13071097.</w:t>
+      </w:r>
+    </w:p>
+    <w:p>
+      <w:pPr>
+        <w:pStyle w:val="References"/>
+        <w:widowControl w:val="1"/>
+        <w:numPr>
+          <w:numId w:val="0"/>
+        </w:numPr>
+        <w:ind w:left="350" w:hanging="350"/>
+        <w:tabs>
+          <w:tab w:val="left" w:pos="350"/>
+        </w:tabs>
+      </w:pPr>
+      <w:r>
+        <w:rPr>
+          <w:rFonts w:ascii="Times New Roman" w:hAnsi="Times New Roman" w:cs="Times New Roman"/>
+          <w:sz w:val="16"/>
+          <w:szCs w:val="16"/>
+          <w:color w:val="000000"/>
+          <w:lang w:val="ru-RU"/>
+        </w:rPr>
+        <w:t xml:space="preserve">[16]</w:t>
+      </w:r>
+      <w:r>
+        <w:tab/>
+      </w:r>
+      <w:r>
+        <w:rPr>
+          <w:rFonts w:ascii="Times New Roman" w:hAnsi="Times New Roman" w:cs="Times New Roman"/>
+          <w:sz w:val="16"/>
+          <w:szCs w:val="16"/>
+          <w:color w:val="000000"/>
+          <w:lang w:val="ru-RU"/>
+        </w:rPr>
+        <w:t xml:space="preserve">V. Cacchiani, M. Iori, A. Locatelli, and S. Martello, “Knapsack problems – An overview of recent advances. Part I: Single knapsack problems,” Computers &amp; Operations Research, vol. 143, art. 105692, 2022. doi: https://doi.org/10.1016/j.cor.2021.105692.</w:t>
+      </w:r>
+    </w:p>
+    <w:p>
+      <w:pPr>
+        <w:pStyle w:val="References"/>
+        <w:widowControl w:val="1"/>
+        <w:numPr>
+          <w:numId w:val="0"/>
+        </w:numPr>
+        <w:ind w:left="350" w:hanging="350"/>
+        <w:tabs>
+          <w:tab w:val="left" w:pos="350"/>
+        </w:tabs>
+      </w:pPr>
+      <w:r>
+        <w:rPr>
+          <w:rFonts w:ascii="Times New Roman" w:hAnsi="Times New Roman" w:cs="Times New Roman"/>
+          <w:sz w:val="16"/>
+          <w:szCs w:val="16"/>
+          <w:color w:val="000000"/>
+          <w:lang w:val="ru-RU"/>
+        </w:rPr>
+        <w:t xml:space="preserve">[17]</w:t>
+      </w:r>
+      <w:r>
+        <w:tab/>
+      </w:r>
+      <w:r>
+        <w:rPr>
+          <w:rFonts w:ascii="Times New Roman" w:hAnsi="Times New Roman" w:cs="Times New Roman"/>
+          <w:sz w:val="16"/>
+          <w:szCs w:val="16"/>
+          <w:color w:val="000000"/>
+          <w:lang w:val="ru-RU"/>
+        </w:rPr>
+        <w:t xml:space="preserve">K. Chaloner and I. Verdinelli, “Bayesian experimental design: A review,” Statistical Science, vol. 10, no. 3, pp. 273–304, 1995. doi: https://doi.org/10.1214/ss/1177009939.</w:t>
+      </w:r>
+    </w:p>
+    <w:p>
+      <w:pPr>
+        <w:pStyle w:val="References"/>
+        <w:widowControl w:val="1"/>
+        <w:numPr>
+          <w:numId w:val="0"/>
+        </w:numPr>
+        <w:ind w:left="350" w:hanging="350"/>
+        <w:tabs>
+          <w:tab w:val="left" w:pos="350"/>
+        </w:tabs>
+      </w:pPr>
+      <w:r>
+        <w:rPr>
+          <w:rFonts w:ascii="Times New Roman" w:hAnsi="Times New Roman" w:cs="Times New Roman"/>
+          <w:sz w:val="16"/>
+          <w:szCs w:val="16"/>
+          <w:color w:val="000000"/>
+          <w:lang w:val="ru-RU"/>
+        </w:rPr>
+        <w:t xml:space="preserve">[18]</w:t>
+      </w:r>
+      <w:r>
+        <w:tab/>
+      </w:r>
+      <w:r>
+        <w:rPr>
+          <w:rFonts w:ascii="Times New Roman" w:hAnsi="Times New Roman" w:cs="Times New Roman"/>
+          <w:sz w:val="16"/>
+          <w:szCs w:val="16"/>
+          <w:color w:val="000000"/>
+          <w:lang w:val="ru-RU"/>
+        </w:rPr>
+        <w:t xml:space="preserve">T. Rainforth, A. Foster, D. R. Ivanova, and F. Bickford Smith, “Modern Bayesian experimental design,” Statistical Science, vol. 39, no. 1, pp. 100–114, 2024. doi: https://doi.org/10.1214/23-STS915.</w:t>
+      </w:r>
+    </w:p>
+    <w:p>
+      <w:pPr>
+        <w:pStyle w:val="References"/>
+        <w:widowControl w:val="1"/>
+        <w:numPr>
+          <w:numId w:val="0"/>
+        </w:numPr>
+        <w:ind w:left="350" w:hanging="350"/>
+        <w:tabs>
+          <w:tab w:val="left" w:pos="350"/>
+        </w:tabs>
+      </w:pPr>
+      <w:r>
+        <w:rPr>
+          <w:rFonts w:ascii="Times New Roman" w:hAnsi="Times New Roman" w:cs="Times New Roman"/>
+          <w:sz w:val="16"/>
+          <w:szCs w:val="16"/>
+          <w:color w:val="000000"/>
+          <w:lang w:val="ru-RU"/>
+        </w:rPr>
+        <w:t xml:space="preserve">[19]</w:t>
+      </w:r>
+      <w:r>
+        <w:tab/>
+      </w:r>
+      <w:r>
+        <w:rPr>
+          <w:rFonts w:ascii="Times New Roman" w:hAnsi="Times New Roman" w:cs="Times New Roman"/>
+          <w:sz w:val="16"/>
+          <w:szCs w:val="16"/>
+          <w:color w:val="000000"/>
+          <w:lang w:val="ru-RU"/>
+        </w:rPr>
+        <w:t xml:space="preserve">X. Huan, J. Jagalur, and Y. Marzouk, “Optimal experimental design: Formulations and computations,” Acta Numerica, vol. 33, pp. 715–840, 2024. doi: https://doi.org/10.1017/S0962492924000023.</w:t>
+      </w:r>
+    </w:p>
+    <w:p>
+      <w:pPr>
+        <w:pStyle w:val="References"/>
+        <w:widowControl w:val="1"/>
+        <w:numPr>
+          <w:numId w:val="0"/>
+        </w:numPr>
+        <w:ind w:left="350" w:hanging="350"/>
+        <w:tabs>
+          <w:tab w:val="left" w:pos="350"/>
+        </w:tabs>
+      </w:pPr>
+      <w:r>
+        <w:rPr>
+          <w:rFonts w:ascii="Times New Roman" w:hAnsi="Times New Roman" w:cs="Times New Roman"/>
+          <w:sz w:val="16"/>
+          <w:szCs w:val="16"/>
+          <w:color w:val="000000"/>
+          <w:lang w:val="ru-RU"/>
+        </w:rPr>
+        <w:t xml:space="preserve">[20]</w:t>
+      </w:r>
+      <w:r>
+        <w:tab/>
+      </w:r>
+      <w:r>
+        <w:rPr>
+          <w:rFonts w:ascii="Times New Roman" w:hAnsi="Times New Roman" w:cs="Times New Roman"/>
+          <w:sz w:val="16"/>
+          <w:szCs w:val="16"/>
+          <w:color w:val="000000"/>
+          <w:lang w:val="ru-RU"/>
+        </w:rPr>
+        <w:t xml:space="preserve">R. J. Mislevy and G. D. Haertel, “Implications of evidence-centered design for educational testing,” Educational Measurement: Issues and Practice, vol. 25, no. 4, pp. 6–20, 2006. doi: https://doi.org/10.1111/j.1745-3992.2006.00075.x.</w:t>
+      </w:r>
+    </w:p>
+    <w:p>
+      <w:pPr>
+        <w:pStyle w:val="References"/>
+        <w:widowControl w:val="1"/>
+        <w:numPr>
+          <w:numId w:val="0"/>
+        </w:numPr>
+        <w:ind w:left="350" w:hanging="350"/>
+        <w:tabs>
+          <w:tab w:val="left" w:pos="350"/>
+        </w:tabs>
+      </w:pPr>
+      <w:r>
+        <w:rPr>
+          <w:rFonts w:ascii="Times New Roman" w:hAnsi="Times New Roman" w:cs="Times New Roman"/>
+          <w:sz w:val="16"/>
+          <w:szCs w:val="16"/>
+          <w:color w:val="000000"/>
+          <w:lang w:val="ru-RU"/>
+        </w:rPr>
+        <w:t xml:space="preserve">[21]</w:t>
+      </w:r>
+      <w:r>
+        <w:tab/>
+      </w:r>
+      <w:r>
+        <w:rPr>
+          <w:rFonts w:ascii="Times New Roman" w:hAnsi="Times New Roman" w:cs="Times New Roman"/>
+          <w:sz w:val="16"/>
+          <w:szCs w:val="16"/>
+          <w:color w:val="000000"/>
+          <w:lang w:val="ru-RU"/>
+        </w:rPr>
+        <w:t xml:space="preserve">NIST Digital Library of Mathematical Functions, “Incomplete beta functions,” §8.17, formula 8.17.5. [Online]. Available: https://dlmf.nist.gov/8.17.E5 (дата обращения: 22.10.2026).</w:t>
+      </w:r>
+    </w:p>
+    <w:p>
+      <w:pPr>
+        <w:pStyle w:val="References"/>
+        <w:widowControl w:val="1"/>
+        <w:numPr>
+          <w:numId w:val="0"/>
+        </w:numPr>
+        <w:ind w:left="350" w:hanging="350"/>
+        <w:tabs>
+          <w:tab w:val="left" w:pos="350"/>
+        </w:tabs>
+      </w:pPr>
+      <w:r>
+        <w:rPr>
+          <w:rFonts w:ascii="Times New Roman" w:hAnsi="Times New Roman" w:cs="Times New Roman"/>
+          <w:sz w:val="16"/>
+          <w:szCs w:val="16"/>
+          <w:color w:val="000000"/>
+          <w:lang w:val="ru-RU"/>
+        </w:rPr>
+        <w:t xml:space="preserve">[22]</w:t>
+      </w:r>
+      <w:r>
+        <w:tab/>
+      </w:r>
+      <w:r>
+        <w:rPr>
+          <w:rFonts w:ascii="Times New Roman" w:hAnsi="Times New Roman" w:cs="Times New Roman"/>
+          <w:sz w:val="16"/>
+          <w:szCs w:val="16"/>
+          <w:color w:val="000000"/>
+          <w:lang w:val="ru-RU"/>
+        </w:rPr>
+        <w:t xml:space="preserve">D. Goldberg, “What every computer scientist should know about floating-point arithmetic,” ACM Computing Surveys, vol. 23, no. 1, pp. 5–48, 1991. doi: https://doi.org/10.1145/103162.103163.</w:t>
+      </w:r>
+    </w:p>
+    <w:p>
+      <w:pPr>
+        <w:pStyle w:val="References"/>
+        <w:widowControl w:val="1"/>
+        <w:numPr>
+          <w:numId w:val="0"/>
+        </w:numPr>
+        <w:ind w:left="350" w:hanging="350"/>
+        <w:tabs>
+          <w:tab w:val="left" w:pos="350"/>
+        </w:tabs>
+      </w:pPr>
+      <w:r>
+        <w:rPr>
+          <w:rFonts w:ascii="Times New Roman" w:hAnsi="Times New Roman" w:cs="Times New Roman"/>
+          <w:sz w:val="16"/>
+          <w:szCs w:val="16"/>
+          <w:color w:val="000000"/>
+          <w:lang w:val="ru-RU"/>
+        </w:rPr>
+        <w:t xml:space="preserve">[23]</w:t>
+      </w:r>
+      <w:r>
+        <w:tab/>
+      </w:r>
+      <w:r>
+        <w:rPr>
+          <w:rFonts w:ascii="Times New Roman" w:hAnsi="Times New Roman" w:cs="Times New Roman"/>
+          <w:sz w:val="16"/>
+          <w:szCs w:val="16"/>
+          <w:color w:val="000000"/>
+          <w:lang w:val="ru-RU"/>
+        </w:rPr>
+        <w:t xml:space="preserve">A. R. DiDonato and A. H. Morris, Jr., “Algorithm 708: Significant digit computation of the incomplete beta function ratios,” ACM Transactions on Mathematical Software, vol. 18, no. 3, pp. 360–373, 1992. doi: https://doi.org/10.1145/131766.131776.</w:t>
+      </w:r>
+    </w:p>
+    <w:p>
+      <w:pPr>
+        <w:pStyle w:val="References"/>
+        <w:widowControl w:val="1"/>
+        <w:numPr>
+          <w:numId w:val="0"/>
+        </w:numPr>
+        <w:ind w:left="350" w:hanging="350"/>
+        <w:tabs>
+          <w:tab w:val="left" w:pos="350"/>
+        </w:tabs>
+      </w:pPr>
+      <w:r>
+        <w:rPr>
+          <w:rFonts w:ascii="Times New Roman" w:hAnsi="Times New Roman" w:cs="Times New Roman"/>
+          <w:sz w:val="16"/>
+          <w:szCs w:val="16"/>
+          <w:color w:val="000000"/>
+          <w:lang w:val="ru-RU"/>
+        </w:rPr>
+        <w:t xml:space="preserve">[24]</w:t>
+      </w:r>
+      <w:r>
+        <w:tab/>
+      </w:r>
+      <w:r>
+        <w:rPr>
+          <w:rFonts w:ascii="Times New Roman" w:hAnsi="Times New Roman" w:cs="Times New Roman"/>
+          <w:sz w:val="16"/>
+          <w:szCs w:val="16"/>
+          <w:color w:val="000000"/>
+          <w:lang w:val="ru-RU"/>
+        </w:rPr>
         <w:t xml:space="preserve">Python Software Foundation, “fractions – Rational numbers,” Python 3.12 documentation. [Online]. Available: https://docs.python.org/3.12/library/fractions.html (дата обращения: 22.10.2026).</w:t>
+      </w:r>
+    </w:p>
+    <w:p>
+      <w:pPr>
+        <w:pStyle w:val="References"/>
+        <w:widowControl w:val="1"/>
+        <w:numPr>
+          <w:numId w:val="0"/>
+        </w:numPr>
+        <w:ind w:left="350" w:hanging="350"/>
+        <w:tabs>
+          <w:tab w:val="left" w:pos="350"/>
+        </w:tabs>
+      </w:pPr>
+      <w:r>
+        <w:rPr>
+          <w:rFonts w:ascii="Times New Roman" w:hAnsi="Times New Roman" w:cs="Times New Roman"/>
+          <w:sz w:val="16"/>
+          <w:szCs w:val="16"/>
+          <w:color w:val="000000"/>
+          <w:lang w:val="ru-RU"/>
+        </w:rPr>
+        <w:t xml:space="preserve">[25]</w:t>
+      </w:r>
+      <w:r>
+        <w:tab/>
+      </w:r>
+      <w:r>
+        <w:rPr>
+          <w:rFonts w:ascii="Times New Roman" w:hAnsi="Times New Roman" w:cs="Times New Roman"/>
+          <w:sz w:val="16"/>
+          <w:szCs w:val="16"/>
+          <w:color w:val="000000"/>
+          <w:lang w:val="ru-RU"/>
+        </w:rPr>
+        <w:t xml:space="preserve">Л. Р. Борисова и М. Н. Фридман, «Анализ некоторых аспектов цифровизации в области оказания образовательных услуг населению методами статистического анализа и машинного обучения», Цифровые решения и технологии искусственного интеллекта, т. 2, № 3, с. 67–78, 2026. doi: https://doi.org/10.26794/3030-7097-2026-2-3-67-78.</w:t>
       </w:r>
     </w:p>
     <w:p>

</xml_diff>